<commit_message>
Clean-up documentation of averaging and clean-up the feature comparison.
</commit_message>
<xml_diff>
--- a/Documentation/FEATURE_COMPARISON_SWIFTUI_VS_PYTHON.docx
+++ b/Documentation/FEATURE_COMPARISON_SWIFTUI_VS_PYTHON.docx
@@ -662,22 +662,22 @@
           <w:b/>
           <w:bCs/>
         </w:rPr>
-        <w:t xml:space="preserve">True multi-tap signal averaging</w:t>
-      </w:r>
-      <w:r>
-        <w:t xml:space="preserve"> </w:t>
-      </w:r>
-      <w:r>
-        <w:t xml:space="preserve">(1–N taps) with per-tap raw sample accumulation in the time domain —</w:t>
-      </w:r>
-      <w:r>
-        <w:t xml:space="preserve"> </w:t>
-      </w:r>
-      <w:r>
-        <w:rPr>
-          <w:rStyle w:val="VerbatimChar"/>
-        </w:rPr>
-        <w:t xml:space="preserve">TapToneAnalyzer.swift</w:t>
+        <w:t xml:space="preserve">Frequency-domain magnitude averaging</w:t>
+      </w:r>
+      <w:r>
+        <w:t xml:space="preserve"> </w:t>
+      </w:r>
+      <w:r>
+        <w:t xml:space="preserve">across 1–N taps — each tap produces a separate gated FFT spectrum; spectra are averaged bin-by-bin in the linear power domain (10^(dB/10)) and converted back to dB —</w:t>
+      </w:r>
+      <w:r>
+        <w:t xml:space="preserve"> </w:t>
+      </w:r>
+      <w:r>
+        <w:rPr>
+          <w:rStyle w:val="VerbatimChar"/>
+        </w:rPr>
+        <w:t xml:space="preserve">TapToneAnalyzer+SpectrumCapture.swift</w:t>
       </w:r>
       <w:r>
         <w:t xml:space="preserve">,</w:t>
@@ -689,7 +689,19 @@
         <w:rPr>
           <w:rStyle w:val="VerbatimChar"/>
         </w:rPr>
-        <w:t xml:space="preserve">TapToneAnalyzer.numberOfTaps</w:t>
+        <w:t xml:space="preserve">averageSpectra()</w:t>
+      </w:r>
+    </w:p>
+    <w:p>
+      <w:pPr>
+        <w:pStyle w:val="Compact"/>
+        <w:numPr>
+          <w:ilvl w:val="0"/>
+          <w:numId w:val="1004"/>
+        </w:numPr>
+      </w:pPr>
+      <w:r>
+        <w:t xml:space="preserve">Phase is implicitly discarded by computing per-tap magnitude spectra independently before averaging, which is correct for non-periodic impulse responses where inter-tap phase alignment cannot be guaranteed</w:t>
       </w:r>
     </w:p>
     <w:p>
@@ -3294,13 +3306,13 @@
       </w:r>
     </w:p>
     <w:bookmarkEnd w:id="26"/>
-    <w:bookmarkStart w:id="27" w:name="continuous-spectrum-averaging"/>
+    <w:bookmarkStart w:id="27" w:name="tap-gated-frequency-domain-averaging"/>
     <w:p>
       <w:pPr>
         <w:pStyle w:val="Heading3"/>
       </w:pPr>
       <w:r>
-        <w:t xml:space="preserve">Continuous Spectrum Averaging</w:t>
+        <w:t xml:space="preserve">Tap-Gated Frequency-Domain Averaging</w:t>
       </w:r>
     </w:p>
     <w:p>
@@ -3316,13 +3328,13 @@
           <w:b/>
           <w:bCs/>
         </w:rPr>
-        <w:t xml:space="preserve">Rolling FFT frame averaging</w:t>
-      </w:r>
-      <w:r>
-        <w:t xml:space="preserve"> </w:t>
-      </w:r>
-      <w:r>
-        <w:t xml:space="preserve">(1–10 frames) with visible averages-completed counter —</w:t>
+        <w:t xml:space="preserve">Frequency-domain magnitude averaging</w:t>
+      </w:r>
+      <w:r>
+        <w:t xml:space="preserve"> </w:t>
+      </w:r>
+      <w:r>
+        <w:t xml:space="preserve">across 1–10 tap-triggered FFT frames — linear magnitudes are accumulated and divided by frame count, then converted to dB —</w:t>
       </w:r>
       <w:r>
         <w:t xml:space="preserve"> </w:t>
@@ -3333,6 +3345,18 @@
         </w:rPr>
         <w:t xml:space="preserve">fft_canvas.py</w:t>
       </w:r>
+      <w:r>
+        <w:t xml:space="preserve">,</w:t>
+      </w:r>
+      <w:r>
+        <w:t xml:space="preserve"> </w:t>
+      </w:r>
+      <w:r>
+        <w:rPr>
+          <w:rStyle w:val="VerbatimChar"/>
+        </w:rPr>
+        <w:t xml:space="preserve">process_averages()</w:t>
+      </w:r>
     </w:p>
     <w:p>
       <w:pPr>
@@ -3343,6 +3367,30 @@
         </w:numPr>
       </w:pPr>
       <w:r>
+        <w:t xml:space="preserve">Averaging is gated by tap detection: only frames that exceed the amplitude threshold and trigger peak detection contribute to the average; ambient noise frames are ignored</w:t>
+      </w:r>
+    </w:p>
+    <w:p>
+      <w:pPr>
+        <w:pStyle w:val="Compact"/>
+        <w:numPr>
+          <w:ilvl w:val="0"/>
+          <w:numId w:val="1019"/>
+        </w:numPr>
+      </w:pPr>
+      <w:r>
+        <w:t xml:space="preserve">Phase is discarded — only magnitude is averaged, which is the correct approach for non-periodic impulse responses where inter-tap phase alignment cannot be guaranteed</w:t>
+      </w:r>
+    </w:p>
+    <w:p>
+      <w:pPr>
+        <w:pStyle w:val="Compact"/>
+        <w:numPr>
+          <w:ilvl w:val="0"/>
+          <w:numId w:val="1019"/>
+        </w:numPr>
+      </w:pPr>
+      <w:r>
         <w:rPr>
           <w:b/>
           <w:bCs/>
@@ -3398,7 +3446,7 @@
         <w:t xml:space="preserve"> </w:t>
       </w:r>
       <w:r>
-        <w:t xml:space="preserve">(green when target reached) —</w:t>
+        <w:t xml:space="preserve">(green when target reached, auto-enables hold) —</w:t>
       </w:r>
       <w:r>
         <w:t xml:space="preserve"> </w:t>

</xml_diff>